<commit_message>
fix(ttab-notice-of-appearance): keep the correspondence request with its address block; regenerate usage outputs
</commit_message>
<xml_diff>
--- a/courts/federal-circuit/trademark-trial-and-appeal-board/notice-of-appearance/usage/OUTPUT-notice-of-appearance-5.docx
+++ b/courts/federal-circuit/trademark-trial-and-appeal-board/notice-of-appearance/usage/OUTPUT-notice-of-appearance-5.docx
@@ -358,10 +358,223 @@
     </w:p>
     <w:p>
       <w:pPr>
-        <w:pStyle w:val="BodyText"/>
-      </w:pPr>
-      <w:r>
-        <w:t xml:space="preserve">Petitioner requests that all correspondence from the Board in this proceeding be directed to, and all service on Petitioner be made on, Petitioner’s counsel at the following address (37 C.F.R. §§ 2.18(a)(2), 2.119(b); TBMP §§ 117.01, 117.07):</w:t>
+        <w:keepNext/>
+        <w:keepLines/>
+        <w:spacing w:before="0" w:after="0" w:line="552" w:lineRule="exact"/>
+        <w:ind w:left="0" w:firstLine="720"/>
+      </w:pPr>
+      <w:r>
+        <w:t xml:space="preserve">Petitioner</w:t>
+      </w:r>
+      <w:r>
+        <w:t xml:space="preserve"> </w:t>
+      </w:r>
+      <w:r>
+        <w:t xml:space="preserve">requests</w:t>
+      </w:r>
+      <w:r>
+        <w:t xml:space="preserve"> </w:t>
+      </w:r>
+      <w:r>
+        <w:t xml:space="preserve">that</w:t>
+      </w:r>
+      <w:r>
+        <w:t xml:space="preserve"> </w:t>
+      </w:r>
+      <w:r>
+        <w:t xml:space="preserve">all</w:t>
+      </w:r>
+      <w:r>
+        <w:t xml:space="preserve"> </w:t>
+      </w:r>
+      <w:r>
+        <w:t xml:space="preserve">correspondence</w:t>
+      </w:r>
+      <w:r>
+        <w:t xml:space="preserve"> </w:t>
+      </w:r>
+      <w:r>
+        <w:t xml:space="preserve">from</w:t>
+      </w:r>
+      <w:r>
+        <w:t xml:space="preserve"> </w:t>
+      </w:r>
+      <w:r>
+        <w:t xml:space="preserve">the</w:t>
+      </w:r>
+      <w:r>
+        <w:t xml:space="preserve"> </w:t>
+      </w:r>
+      <w:r>
+        <w:t xml:space="preserve">Board</w:t>
+      </w:r>
+      <w:r>
+        <w:t xml:space="preserve"> </w:t>
+      </w:r>
+      <w:r>
+        <w:t xml:space="preserve">in</w:t>
+      </w:r>
+      <w:r>
+        <w:t xml:space="preserve"> </w:t>
+      </w:r>
+      <w:r>
+        <w:t xml:space="preserve">this</w:t>
+      </w:r>
+      <w:r>
+        <w:t xml:space="preserve"> </w:t>
+      </w:r>
+      <w:r>
+        <w:t xml:space="preserve">proceeding</w:t>
+      </w:r>
+      <w:r>
+        <w:t xml:space="preserve"> </w:t>
+      </w:r>
+      <w:r>
+        <w:t xml:space="preserve">be</w:t>
+      </w:r>
+      <w:r>
+        <w:t xml:space="preserve"> </w:t>
+      </w:r>
+      <w:r>
+        <w:t xml:space="preserve">directed</w:t>
+      </w:r>
+      <w:r>
+        <w:t xml:space="preserve"> </w:t>
+      </w:r>
+      <w:r>
+        <w:t xml:space="preserve">to,</w:t>
+      </w:r>
+      <w:r>
+        <w:t xml:space="preserve"> </w:t>
+      </w:r>
+      <w:r>
+        <w:t xml:space="preserve">and</w:t>
+      </w:r>
+      <w:r>
+        <w:t xml:space="preserve"> </w:t>
+      </w:r>
+      <w:r>
+        <w:t xml:space="preserve">all</w:t>
+      </w:r>
+      <w:r>
+        <w:t xml:space="preserve"> </w:t>
+      </w:r>
+      <w:r>
+        <w:t xml:space="preserve">service</w:t>
+      </w:r>
+      <w:r>
+        <w:t xml:space="preserve"> </w:t>
+      </w:r>
+      <w:r>
+        <w:t xml:space="preserve">on</w:t>
+      </w:r>
+      <w:r>
+        <w:t xml:space="preserve"> </w:t>
+      </w:r>
+      <w:r>
+        <w:t xml:space="preserve">Petitioner</w:t>
+      </w:r>
+      <w:r>
+        <w:t xml:space="preserve"> </w:t>
+      </w:r>
+      <w:r>
+        <w:t xml:space="preserve">be</w:t>
+      </w:r>
+      <w:r>
+        <w:t xml:space="preserve"> </w:t>
+      </w:r>
+      <w:r>
+        <w:t xml:space="preserve">made</w:t>
+      </w:r>
+      <w:r>
+        <w:t xml:space="preserve"> </w:t>
+      </w:r>
+      <w:r>
+        <w:t xml:space="preserve">on,</w:t>
+      </w:r>
+      <w:r>
+        <w:t xml:space="preserve"> </w:t>
+      </w:r>
+      <w:r>
+        <w:t xml:space="preserve">Petitioner’s</w:t>
+      </w:r>
+      <w:r>
+        <w:t xml:space="preserve"> </w:t>
+      </w:r>
+      <w:r>
+        <w:t xml:space="preserve">counsel</w:t>
+      </w:r>
+      <w:r>
+        <w:t xml:space="preserve"> </w:t>
+      </w:r>
+      <w:r>
+        <w:t xml:space="preserve">at</w:t>
+      </w:r>
+      <w:r>
+        <w:t xml:space="preserve"> </w:t>
+      </w:r>
+      <w:r>
+        <w:t xml:space="preserve">the</w:t>
+      </w:r>
+      <w:r>
+        <w:t xml:space="preserve"> </w:t>
+      </w:r>
+      <w:r>
+        <w:t xml:space="preserve">following</w:t>
+      </w:r>
+      <w:r>
+        <w:t xml:space="preserve"> </w:t>
+      </w:r>
+      <w:r>
+        <w:t xml:space="preserve">address</w:t>
+      </w:r>
+      <w:r>
+        <w:t xml:space="preserve"> </w:t>
+      </w:r>
+      <w:r>
+        <w:t xml:space="preserve">(37 C.F.R.</w:t>
+      </w:r>
+      <w:r>
+        <w:t xml:space="preserve"> </w:t>
+      </w:r>
+      <w:r>
+        <w:t xml:space="preserve">§§</w:t>
+      </w:r>
+      <w:r>
+        <w:t xml:space="preserve"> </w:t>
+      </w:r>
+      <w:r>
+        <w:t xml:space="preserve">2.18(a)(2),</w:t>
+      </w:r>
+      <w:r>
+        <w:t xml:space="preserve"> </w:t>
+      </w:r>
+      <w:r>
+        <w:t xml:space="preserve">2.119(b);</w:t>
+      </w:r>
+      <w:r>
+        <w:t xml:space="preserve"> </w:t>
+      </w:r>
+      <w:r>
+        <w:t xml:space="preserve">TBMP</w:t>
+      </w:r>
+      <w:r>
+        <w:t xml:space="preserve"> </w:t>
+      </w:r>
+      <w:r>
+        <w:t xml:space="preserve">§§</w:t>
+      </w:r>
+      <w:r>
+        <w:t xml:space="preserve"> </w:t>
+      </w:r>
+      <w:r>
+        <w:t xml:space="preserve">117.01,</w:t>
+      </w:r>
+      <w:r>
+        <w:t xml:space="preserve"> </w:t>
+      </w:r>
+      <w:r>
+        <w:t xml:space="preserve">117.07):</w:t>
       </w:r>
     </w:p>
     <w:p>

</xml_diff>